<commit_message>
Added Solution for the Activity 12.5
</commit_message>
<xml_diff>
--- a/04_Coding_Activities/CA_12_5_Serverless_Cloud_Database_Container/Documentation/Activity 12.5_Modify a Serverless Cloud Database in a Container.docx
+++ b/04_Coding_Activities/CA_12_5_Serverless_Cloud_Database_Container/Documentation/Activity 12.5_Modify a Serverless Cloud Database in a Container.docx
@@ -18,6 +18,45 @@
       </w:r>
     </w:p>
     <w:p>
+      <w:hyperlink r:id="rId5" w:history="1">
+        <w:r>
+          <w:rPr>
+            <w:rStyle w:val="Hyperlink"/>
+          </w:rPr>
+          <w:t xml:space="preserve">Link on </w:t>
+        </w:r>
+        <w:proofErr w:type="spellStart"/>
+        <w:r>
+          <w:rPr>
+            <w:rStyle w:val="Hyperlink"/>
+          </w:rPr>
+          <w:t>G</w:t>
+        </w:r>
+        <w:r>
+          <w:rPr>
+            <w:rStyle w:val="Hyperlink"/>
+          </w:rPr>
+          <w:t>i</w:t>
+        </w:r>
+        <w:r>
+          <w:rPr>
+            <w:rStyle w:val="Hyperlink"/>
+          </w:rPr>
+          <w:t>t</w:t>
+        </w:r>
+        <w:r>
+          <w:rPr>
+            <w:rStyle w:val="Hyperlink"/>
+          </w:rPr>
+          <w:t>hub</w:t>
+        </w:r>
+        <w:proofErr w:type="spellEnd"/>
+      </w:hyperlink>
+      <w:r>
+        <w:t>:</w:t>
+      </w:r>
+    </w:p>
+    <w:p>
       <w:pPr>
         <w:rPr>
           <w:sz w:val="36"/>
@@ -41,6 +80,48 @@
       <w:pPr>
         <w:pStyle w:val="ListParagraph"/>
       </w:pPr>
+      <w:r>
+        <w:drawing>
+          <wp:inline distT="0" distB="0" distL="0" distR="0" wp14:anchorId="49F1BB3F" wp14:editId="6DF6458C">
+            <wp:extent cx="5943600" cy="3403600"/>
+            <wp:effectExtent l="0" t="0" r="0" b="6350"/>
+            <wp:docPr id="591748520" name="Picture 1"/>
+            <wp:cNvGraphicFramePr>
+              <a:graphicFrameLocks xmlns:a="http://schemas.openxmlformats.org/drawingml/2006/main" noChangeAspect="1"/>
+            </wp:cNvGraphicFramePr>
+            <a:graphic xmlns:a="http://schemas.openxmlformats.org/drawingml/2006/main">
+              <a:graphicData uri="http://schemas.openxmlformats.org/drawingml/2006/picture">
+                <pic:pic xmlns:pic="http://schemas.openxmlformats.org/drawingml/2006/picture">
+                  <pic:nvPicPr>
+                    <pic:cNvPr id="591748520" name=""/>
+                    <pic:cNvPicPr/>
+                  </pic:nvPicPr>
+                  <pic:blipFill>
+                    <a:blip r:embed="rId6"/>
+                    <a:stretch>
+                      <a:fillRect/>
+                    </a:stretch>
+                  </pic:blipFill>
+                  <pic:spPr>
+                    <a:xfrm>
+                      <a:off x="0" y="0"/>
+                      <a:ext cx="5943600" cy="3403600"/>
+                    </a:xfrm>
+                    <a:prstGeom prst="rect">
+                      <a:avLst/>
+                    </a:prstGeom>
+                  </pic:spPr>
+                </pic:pic>
+              </a:graphicData>
+            </a:graphic>
+          </wp:inline>
+        </w:drawing>
+      </w:r>
+    </w:p>
+    <w:p>
+      <w:pPr>
+        <w:pStyle w:val="ListParagraph"/>
+      </w:pPr>
     </w:p>
     <w:p>
       <w:pPr>
@@ -66,11 +147,43 @@
       <w:pPr>
         <w:pStyle w:val="ListParagraph"/>
       </w:pPr>
-    </w:p>
-    <w:p>
-      <w:pPr>
-        <w:pStyle w:val="ListParagraph"/>
-      </w:pPr>
+      <w:r>
+        <w:drawing>
+          <wp:inline distT="0" distB="0" distL="0" distR="0" wp14:anchorId="333C4508" wp14:editId="755224B6">
+            <wp:extent cx="4271073" cy="2582265"/>
+            <wp:effectExtent l="0" t="0" r="0" b="8890"/>
+            <wp:docPr id="1505267049" name="Picture 1"/>
+            <wp:cNvGraphicFramePr>
+              <a:graphicFrameLocks xmlns:a="http://schemas.openxmlformats.org/drawingml/2006/main" noChangeAspect="1"/>
+            </wp:cNvGraphicFramePr>
+            <a:graphic xmlns:a="http://schemas.openxmlformats.org/drawingml/2006/main">
+              <a:graphicData uri="http://schemas.openxmlformats.org/drawingml/2006/picture">
+                <pic:pic xmlns:pic="http://schemas.openxmlformats.org/drawingml/2006/picture">
+                  <pic:nvPicPr>
+                    <pic:cNvPr id="1505267049" name=""/>
+                    <pic:cNvPicPr/>
+                  </pic:nvPicPr>
+                  <pic:blipFill>
+                    <a:blip r:embed="rId7"/>
+                    <a:stretch>
+                      <a:fillRect/>
+                    </a:stretch>
+                  </pic:blipFill>
+                  <pic:spPr>
+                    <a:xfrm>
+                      <a:off x="0" y="0"/>
+                      <a:ext cx="4288318" cy="2592691"/>
+                    </a:xfrm>
+                    <a:prstGeom prst="rect">
+                      <a:avLst/>
+                    </a:prstGeom>
+                  </pic:spPr>
+                </pic:pic>
+              </a:graphicData>
+            </a:graphic>
+          </wp:inline>
+        </w:drawing>
+      </w:r>
     </w:p>
     <w:p>
       <w:pPr>
@@ -81,6 +194,7 @@
         </w:numPr>
       </w:pPr>
       <w:r>
+        <w:lastRenderedPageBreak/>
         <w:t xml:space="preserve">Provide two screenshots: One screenshot showing that you navigated to the correct page in Firebase to obtain the private key and one screenshot showing that you copied the file into the </w:t>
       </w:r>
       <w:proofErr w:type="spellStart"/>
@@ -91,6 +205,108 @@
       <w:r>
         <w:t xml:space="preserve"> file correctly.</w:t>
       </w:r>
+    </w:p>
+    <w:p>
+      <w:pPr>
+        <w:pStyle w:val="ListParagraph"/>
+      </w:pPr>
+      <w:r>
+        <w:drawing>
+          <wp:inline distT="0" distB="0" distL="0" distR="0" wp14:anchorId="632683FA" wp14:editId="64FA36AE">
+            <wp:extent cx="5943600" cy="4068445"/>
+            <wp:effectExtent l="0" t="0" r="0" b="8255"/>
+            <wp:docPr id="1770749105" name="Picture 1"/>
+            <wp:cNvGraphicFramePr>
+              <a:graphicFrameLocks xmlns:a="http://schemas.openxmlformats.org/drawingml/2006/main" noChangeAspect="1"/>
+            </wp:cNvGraphicFramePr>
+            <a:graphic xmlns:a="http://schemas.openxmlformats.org/drawingml/2006/main">
+              <a:graphicData uri="http://schemas.openxmlformats.org/drawingml/2006/picture">
+                <pic:pic xmlns:pic="http://schemas.openxmlformats.org/drawingml/2006/picture">
+                  <pic:nvPicPr>
+                    <pic:cNvPr id="1770749105" name=""/>
+                    <pic:cNvPicPr/>
+                  </pic:nvPicPr>
+                  <pic:blipFill>
+                    <a:blip r:embed="rId8"/>
+                    <a:stretch>
+                      <a:fillRect/>
+                    </a:stretch>
+                  </pic:blipFill>
+                  <pic:spPr>
+                    <a:xfrm>
+                      <a:off x="0" y="0"/>
+                      <a:ext cx="5943600" cy="4068445"/>
+                    </a:xfrm>
+                    <a:prstGeom prst="rect">
+                      <a:avLst/>
+                    </a:prstGeom>
+                  </pic:spPr>
+                </pic:pic>
+              </a:graphicData>
+            </a:graphic>
+          </wp:inline>
+        </w:drawing>
+      </w:r>
+    </w:p>
+    <w:p>
+      <w:pPr>
+        <w:pStyle w:val="ListParagraph"/>
+      </w:pPr>
+    </w:p>
+    <w:p>
+      <w:pPr>
+        <w:pStyle w:val="ListParagraph"/>
+      </w:pPr>
+      <w:r>
+        <w:t>Download window:</w:t>
+      </w:r>
+    </w:p>
+    <w:p>
+      <w:pPr>
+        <w:pStyle w:val="ListParagraph"/>
+      </w:pPr>
+      <w:r>
+        <w:drawing>
+          <wp:inline distT="0" distB="0" distL="0" distR="0" wp14:anchorId="4EA8FE50" wp14:editId="73C3B7E1">
+            <wp:extent cx="5943600" cy="2794000"/>
+            <wp:effectExtent l="0" t="0" r="0" b="6350"/>
+            <wp:docPr id="187736472" name="Picture 1"/>
+            <wp:cNvGraphicFramePr>
+              <a:graphicFrameLocks xmlns:a="http://schemas.openxmlformats.org/drawingml/2006/main" noChangeAspect="1"/>
+            </wp:cNvGraphicFramePr>
+            <a:graphic xmlns:a="http://schemas.openxmlformats.org/drawingml/2006/main">
+              <a:graphicData uri="http://schemas.openxmlformats.org/drawingml/2006/picture">
+                <pic:pic xmlns:pic="http://schemas.openxmlformats.org/drawingml/2006/picture">
+                  <pic:nvPicPr>
+                    <pic:cNvPr id="187736472" name=""/>
+                    <pic:cNvPicPr/>
+                  </pic:nvPicPr>
+                  <pic:blipFill>
+                    <a:blip r:embed="rId9"/>
+                    <a:stretch>
+                      <a:fillRect/>
+                    </a:stretch>
+                  </pic:blipFill>
+                  <pic:spPr>
+                    <a:xfrm>
+                      <a:off x="0" y="0"/>
+                      <a:ext cx="5943600" cy="2794000"/>
+                    </a:xfrm>
+                    <a:prstGeom prst="rect">
+                      <a:avLst/>
+                    </a:prstGeom>
+                  </pic:spPr>
+                </pic:pic>
+              </a:graphicData>
+            </a:graphic>
+          </wp:inline>
+        </w:drawing>
+      </w:r>
+    </w:p>
+    <w:p>
+      <w:pPr>
+        <w:pStyle w:val="ListParagraph"/>
+      </w:pPr>
     </w:p>
     <w:p>
       <w:pPr>
@@ -106,6 +322,7 @@
         </w:numPr>
       </w:pPr>
       <w:r>
+        <w:lastRenderedPageBreak/>
         <w:t>Provide a screenshot to show that you created an empty Realtime database for your project in Firebase.</w:t>
       </w:r>
     </w:p>
@@ -113,6 +330,43 @@
       <w:pPr>
         <w:pStyle w:val="ListParagraph"/>
       </w:pPr>
+      <w:r>
+        <w:drawing>
+          <wp:inline distT="0" distB="0" distL="0" distR="0" wp14:anchorId="4F4441AC" wp14:editId="6C66A78C">
+            <wp:extent cx="5943600" cy="2964815"/>
+            <wp:effectExtent l="0" t="0" r="0" b="6985"/>
+            <wp:docPr id="1090101124" name="Picture 1"/>
+            <wp:cNvGraphicFramePr>
+              <a:graphicFrameLocks xmlns:a="http://schemas.openxmlformats.org/drawingml/2006/main" noChangeAspect="1"/>
+            </wp:cNvGraphicFramePr>
+            <a:graphic xmlns:a="http://schemas.openxmlformats.org/drawingml/2006/main">
+              <a:graphicData uri="http://schemas.openxmlformats.org/drawingml/2006/picture">
+                <pic:pic xmlns:pic="http://schemas.openxmlformats.org/drawingml/2006/picture">
+                  <pic:nvPicPr>
+                    <pic:cNvPr id="1090101124" name=""/>
+                    <pic:cNvPicPr/>
+                  </pic:nvPicPr>
+                  <pic:blipFill>
+                    <a:blip r:embed="rId10"/>
+                    <a:stretch>
+                      <a:fillRect/>
+                    </a:stretch>
+                  </pic:blipFill>
+                  <pic:spPr>
+                    <a:xfrm>
+                      <a:off x="0" y="0"/>
+                      <a:ext cx="5943600" cy="2964815"/>
+                    </a:xfrm>
+                    <a:prstGeom prst="rect">
+                      <a:avLst/>
+                    </a:prstGeom>
+                  </pic:spPr>
+                </pic:pic>
+              </a:graphicData>
+            </a:graphic>
+          </wp:inline>
+        </w:drawing>
+      </w:r>
     </w:p>
     <w:p>
       <w:pPr>
@@ -143,6 +397,48 @@
       <w:pPr>
         <w:pStyle w:val="ListParagraph"/>
       </w:pPr>
+      <w:r>
+        <w:drawing>
+          <wp:inline distT="0" distB="0" distL="0" distR="0" wp14:anchorId="59B60997" wp14:editId="6E5535A9">
+            <wp:extent cx="5943600" cy="2901950"/>
+            <wp:effectExtent l="0" t="0" r="0" b="0"/>
+            <wp:docPr id="286546200" name="Picture 1"/>
+            <wp:cNvGraphicFramePr>
+              <a:graphicFrameLocks xmlns:a="http://schemas.openxmlformats.org/drawingml/2006/main" noChangeAspect="1"/>
+            </wp:cNvGraphicFramePr>
+            <a:graphic xmlns:a="http://schemas.openxmlformats.org/drawingml/2006/main">
+              <a:graphicData uri="http://schemas.openxmlformats.org/drawingml/2006/picture">
+                <pic:pic xmlns:pic="http://schemas.openxmlformats.org/drawingml/2006/picture">
+                  <pic:nvPicPr>
+                    <pic:cNvPr id="286546200" name=""/>
+                    <pic:cNvPicPr/>
+                  </pic:nvPicPr>
+                  <pic:blipFill>
+                    <a:blip r:embed="rId11"/>
+                    <a:stretch>
+                      <a:fillRect/>
+                    </a:stretch>
+                  </pic:blipFill>
+                  <pic:spPr>
+                    <a:xfrm>
+                      <a:off x="0" y="0"/>
+                      <a:ext cx="5943600" cy="2901950"/>
+                    </a:xfrm>
+                    <a:prstGeom prst="rect">
+                      <a:avLst/>
+                    </a:prstGeom>
+                  </pic:spPr>
+                </pic:pic>
+              </a:graphicData>
+            </a:graphic>
+          </wp:inline>
+        </w:drawing>
+      </w:r>
+    </w:p>
+    <w:p>
+      <w:pPr>
+        <w:pStyle w:val="ListParagraph"/>
+      </w:pPr>
     </w:p>
     <w:p>
       <w:pPr>
@@ -200,7 +496,68 @@
         </w:numPr>
       </w:pPr>
       <w:r>
+        <w:lastRenderedPageBreak/>
         <w:t>Provide a screenshot of your Terminal window to show that your database has been written as expected.</w:t>
+      </w:r>
+    </w:p>
+    <w:p>
+      <w:pPr>
+        <w:pStyle w:val="ListParagraph"/>
+      </w:pPr>
+    </w:p>
+    <w:p>
+      <w:pPr>
+        <w:pStyle w:val="ListParagraph"/>
+      </w:pPr>
+      <w:r>
+        <w:t>Update on Database properly reflected:</w:t>
+      </w:r>
+    </w:p>
+    <w:p>
+      <w:pPr>
+        <w:pStyle w:val="ListParagraph"/>
+      </w:pPr>
+    </w:p>
+    <w:p>
+      <w:pPr>
+        <w:pStyle w:val="ListParagraph"/>
+      </w:pPr>
+      <w:r>
+        <w:drawing>
+          <wp:inline distT="0" distB="0" distL="0" distR="0" wp14:anchorId="16399364" wp14:editId="6DA24603">
+            <wp:extent cx="5943600" cy="4399915"/>
+            <wp:effectExtent l="0" t="0" r="0" b="635"/>
+            <wp:docPr id="1758745916" name="Picture 1"/>
+            <wp:cNvGraphicFramePr>
+              <a:graphicFrameLocks xmlns:a="http://schemas.openxmlformats.org/drawingml/2006/main" noChangeAspect="1"/>
+            </wp:cNvGraphicFramePr>
+            <a:graphic xmlns:a="http://schemas.openxmlformats.org/drawingml/2006/main">
+              <a:graphicData uri="http://schemas.openxmlformats.org/drawingml/2006/picture">
+                <pic:pic xmlns:pic="http://schemas.openxmlformats.org/drawingml/2006/picture">
+                  <pic:nvPicPr>
+                    <pic:cNvPr id="1758745916" name=""/>
+                    <pic:cNvPicPr/>
+                  </pic:nvPicPr>
+                  <pic:blipFill>
+                    <a:blip r:embed="rId12"/>
+                    <a:stretch>
+                      <a:fillRect/>
+                    </a:stretch>
+                  </pic:blipFill>
+                  <pic:spPr>
+                    <a:xfrm>
+                      <a:off x="0" y="0"/>
+                      <a:ext cx="5943600" cy="4399915"/>
+                    </a:xfrm>
+                    <a:prstGeom prst="rect">
+                      <a:avLst/>
+                    </a:prstGeom>
+                  </pic:spPr>
+                </pic:pic>
+              </a:graphicData>
+            </a:graphic>
+          </wp:inline>
+        </w:drawing>
       </w:r>
     </w:p>
     <w:sectPr>
@@ -1224,6 +1581,41 @@
       <w:spacing w:val="5"/>
     </w:rPr>
   </w:style>
+  <w:style w:type="character" w:styleId="Hyperlink">
+    <w:name w:val="Hyperlink"/>
+    <w:basedOn w:val="DefaultParagraphFont"/>
+    <w:uiPriority w:val="99"/>
+    <w:unhideWhenUsed/>
+    <w:rsid w:val="00817238"/>
+    <w:rPr>
+      <w:color w:val="0563C1" w:themeColor="hyperlink"/>
+      <w:u w:val="single"/>
+    </w:rPr>
+  </w:style>
+  <w:style w:type="character" w:styleId="UnresolvedMention">
+    <w:name w:val="Unresolved Mention"/>
+    <w:basedOn w:val="DefaultParagraphFont"/>
+    <w:uiPriority w:val="99"/>
+    <w:semiHidden/>
+    <w:unhideWhenUsed/>
+    <w:rsid w:val="00817238"/>
+    <w:rPr>
+      <w:color w:val="605E5C"/>
+      <w:shd w:val="clear" w:color="auto" w:fill="E1DFDD"/>
+    </w:rPr>
+  </w:style>
+  <w:style w:type="character" w:styleId="FollowedHyperlink">
+    <w:name w:val="FollowedHyperlink"/>
+    <w:basedOn w:val="DefaultParagraphFont"/>
+    <w:uiPriority w:val="99"/>
+    <w:semiHidden/>
+    <w:unhideWhenUsed/>
+    <w:rsid w:val="00817238"/>
+    <w:rPr>
+      <w:color w:val="954F72" w:themeColor="followedHyperlink"/>
+      <w:u w:val="single"/>
+    </w:rPr>
+  </w:style>
 </w:styles>
 </file>
 

</xml_diff>

<commit_message>
Added screenshts for the documnetation
</commit_message>
<xml_diff>
--- a/04_Coding_Activities/CA_12_5_Serverless_Cloud_Database_Container/Documentation/Activity 12.5_Modify a Serverless Cloud Database in a Container.docx
+++ b/04_Coding_Activities/CA_12_5_Serverless_Cloud_Database_Container/Documentation/Activity 12.5_Modify a Serverless Cloud Database in a Container.docx
@@ -36,19 +36,7 @@
           <w:rPr>
             <w:rStyle w:val="Hyperlink"/>
           </w:rPr>
-          <w:t>i</w:t>
-        </w:r>
-        <w:r>
-          <w:rPr>
-            <w:rStyle w:val="Hyperlink"/>
-          </w:rPr>
-          <w:t>t</w:t>
-        </w:r>
-        <w:r>
-          <w:rPr>
-            <w:rStyle w:val="Hyperlink"/>
-          </w:rPr>
-          <w:t>hub</w:t>
+          <w:t>ithub</w:t>
         </w:r>
         <w:proofErr w:type="spellEnd"/>
       </w:hyperlink>
@@ -81,6 +69,9 @@
         <w:pStyle w:val="ListParagraph"/>
       </w:pPr>
       <w:r>
+        <w:rPr>
+          <w:noProof/>
+        </w:rPr>
         <w:drawing>
           <wp:inline distT="0" distB="0" distL="0" distR="0" wp14:anchorId="49F1BB3F" wp14:editId="6DF6458C">
             <wp:extent cx="5943600" cy="3403600"/>
@@ -148,6 +139,9 @@
         <w:pStyle w:val="ListParagraph"/>
       </w:pPr>
       <w:r>
+        <w:rPr>
+          <w:noProof/>
+        </w:rPr>
         <w:drawing>
           <wp:inline distT="0" distB="0" distL="0" distR="0" wp14:anchorId="333C4508" wp14:editId="755224B6">
             <wp:extent cx="4271073" cy="2582265"/>
@@ -211,6 +205,9 @@
         <w:pStyle w:val="ListParagraph"/>
       </w:pPr>
       <w:r>
+        <w:rPr>
+          <w:noProof/>
+        </w:rPr>
         <w:drawing>
           <wp:inline distT="0" distB="0" distL="0" distR="0" wp14:anchorId="632683FA" wp14:editId="64FA36AE">
             <wp:extent cx="5943600" cy="4068445"/>
@@ -266,6 +263,9 @@
         <w:pStyle w:val="ListParagraph"/>
       </w:pPr>
       <w:r>
+        <w:rPr>
+          <w:noProof/>
+        </w:rPr>
         <w:drawing>
           <wp:inline distT="0" distB="0" distL="0" distR="0" wp14:anchorId="4EA8FE50" wp14:editId="73C3B7E1">
             <wp:extent cx="5943600" cy="2794000"/>
@@ -331,6 +331,9 @@
         <w:pStyle w:val="ListParagraph"/>
       </w:pPr>
       <w:r>
+        <w:rPr>
+          <w:noProof/>
+        </w:rPr>
         <w:drawing>
           <wp:inline distT="0" distB="0" distL="0" distR="0" wp14:anchorId="4F4441AC" wp14:editId="6C66A78C">
             <wp:extent cx="5943600" cy="2964815"/>
@@ -397,7 +400,15 @@
       <w:pPr>
         <w:pStyle w:val="ListParagraph"/>
       </w:pPr>
-      <w:r>
+    </w:p>
+    <w:p>
+      <w:pPr>
+        <w:pStyle w:val="ListParagraph"/>
+      </w:pPr>
+      <w:r>
+        <w:rPr>
+          <w:noProof/>
+        </w:rPr>
         <w:drawing>
           <wp:inline distT="0" distB="0" distL="0" distR="0" wp14:anchorId="59B60997" wp14:editId="6E5535A9">
             <wp:extent cx="5943600" cy="2901950"/>
@@ -443,6 +454,100 @@
     <w:p>
       <w:pPr>
         <w:pStyle w:val="ListParagraph"/>
+      </w:pPr>
+    </w:p>
+    <w:p>
+      <w:pPr>
+        <w:pStyle w:val="ListParagraph"/>
+      </w:pPr>
+    </w:p>
+    <w:p>
+      <w:pPr>
+        <w:pStyle w:val="ListParagraph"/>
+      </w:pPr>
+    </w:p>
+    <w:p>
+      <w:pPr>
+        <w:pStyle w:val="ListParagraph"/>
+      </w:pPr>
+    </w:p>
+    <w:p>
+      <w:pPr>
+        <w:pStyle w:val="ListParagraph"/>
+      </w:pPr>
+    </w:p>
+    <w:p>
+      <w:pPr>
+        <w:pStyle w:val="ListParagraph"/>
+      </w:pPr>
+      <w:r>
+        <w:lastRenderedPageBreak/>
+        <w:t xml:space="preserve">Data to be added </w:t>
+      </w:r>
+      <w:proofErr w:type="gramStart"/>
+      <w:r>
+        <w:t>on</w:t>
+      </w:r>
+      <w:proofErr w:type="gramEnd"/>
+      <w:r>
+        <w:t xml:space="preserve"> the database:</w:t>
+      </w:r>
+    </w:p>
+    <w:p>
+      <w:pPr>
+        <w:pStyle w:val="ListParagraph"/>
+      </w:pPr>
+      <w:r>
+        <w:drawing>
+          <wp:inline distT="0" distB="0" distL="0" distR="0" wp14:anchorId="795E0BB7" wp14:editId="68DC6DDA">
+            <wp:extent cx="5943600" cy="3080385"/>
+            <wp:effectExtent l="0" t="0" r="0" b="5715"/>
+            <wp:docPr id="1330940914" name="Picture 1"/>
+            <wp:cNvGraphicFramePr>
+              <a:graphicFrameLocks xmlns:a="http://schemas.openxmlformats.org/drawingml/2006/main" noChangeAspect="1"/>
+            </wp:cNvGraphicFramePr>
+            <a:graphic xmlns:a="http://schemas.openxmlformats.org/drawingml/2006/main">
+              <a:graphicData uri="http://schemas.openxmlformats.org/drawingml/2006/picture">
+                <pic:pic xmlns:pic="http://schemas.openxmlformats.org/drawingml/2006/picture">
+                  <pic:nvPicPr>
+                    <pic:cNvPr id="1330940914" name=""/>
+                    <pic:cNvPicPr/>
+                  </pic:nvPicPr>
+                  <pic:blipFill>
+                    <a:blip r:embed="rId12"/>
+                    <a:stretch>
+                      <a:fillRect/>
+                    </a:stretch>
+                  </pic:blipFill>
+                  <pic:spPr>
+                    <a:xfrm>
+                      <a:off x="0" y="0"/>
+                      <a:ext cx="5943600" cy="3080385"/>
+                    </a:xfrm>
+                    <a:prstGeom prst="rect">
+                      <a:avLst/>
+                    </a:prstGeom>
+                  </pic:spPr>
+                </pic:pic>
+              </a:graphicData>
+            </a:graphic>
+          </wp:inline>
+        </w:drawing>
+      </w:r>
+    </w:p>
+    <w:p>
+      <w:pPr>
+        <w:pStyle w:val="ListParagraph"/>
+      </w:pPr>
+    </w:p>
+    <w:p>
+      <w:pPr>
+        <w:pStyle w:val="ListParagraph"/>
+      </w:pPr>
+    </w:p>
+    <w:p>
+      <w:pPr>
+        <w:pStyle w:val="ListParagraph"/>
         <w:numPr>
           <w:ilvl w:val="0"/>
           <w:numId w:val="1"/>
@@ -461,6 +566,374 @@
       <w:pPr>
         <w:pStyle w:val="ListParagraph"/>
       </w:pPr>
+      <w:r>
+        <w:drawing>
+          <wp:inline distT="0" distB="0" distL="0" distR="0" wp14:anchorId="000877CF" wp14:editId="18CEC4CF">
+            <wp:extent cx="5943600" cy="2583815"/>
+            <wp:effectExtent l="0" t="0" r="0" b="6985"/>
+            <wp:docPr id="960774692" name="Picture 1"/>
+            <wp:cNvGraphicFramePr>
+              <a:graphicFrameLocks xmlns:a="http://schemas.openxmlformats.org/drawingml/2006/main" noChangeAspect="1"/>
+            </wp:cNvGraphicFramePr>
+            <a:graphic xmlns:a="http://schemas.openxmlformats.org/drawingml/2006/main">
+              <a:graphicData uri="http://schemas.openxmlformats.org/drawingml/2006/picture">
+                <pic:pic xmlns:pic="http://schemas.openxmlformats.org/drawingml/2006/picture">
+                  <pic:nvPicPr>
+                    <pic:cNvPr id="960774692" name=""/>
+                    <pic:cNvPicPr/>
+                  </pic:nvPicPr>
+                  <pic:blipFill>
+                    <a:blip r:embed="rId13"/>
+                    <a:stretch>
+                      <a:fillRect/>
+                    </a:stretch>
+                  </pic:blipFill>
+                  <pic:spPr>
+                    <a:xfrm>
+                      <a:off x="0" y="0"/>
+                      <a:ext cx="5943600" cy="2583815"/>
+                    </a:xfrm>
+                    <a:prstGeom prst="rect">
+                      <a:avLst/>
+                    </a:prstGeom>
+                  </pic:spPr>
+                </pic:pic>
+              </a:graphicData>
+            </a:graphic>
+          </wp:inline>
+        </w:drawing>
+      </w:r>
+    </w:p>
+    <w:p>
+      <w:pPr>
+        <w:pStyle w:val="ListParagraph"/>
+      </w:pPr>
+    </w:p>
+    <w:p>
+      <w:pPr>
+        <w:pStyle w:val="ListParagraph"/>
+      </w:pPr>
+    </w:p>
+    <w:p>
+      <w:pPr>
+        <w:pStyle w:val="ListParagraph"/>
+      </w:pPr>
+    </w:p>
+    <w:p>
+      <w:pPr>
+        <w:pStyle w:val="ListParagraph"/>
+      </w:pPr>
+    </w:p>
+    <w:p>
+      <w:pPr>
+        <w:pStyle w:val="ListParagraph"/>
+      </w:pPr>
+    </w:p>
+    <w:p>
+      <w:pPr>
+        <w:pStyle w:val="ListParagraph"/>
+      </w:pPr>
+    </w:p>
+    <w:p>
+      <w:pPr>
+        <w:pStyle w:val="ListParagraph"/>
+      </w:pPr>
+    </w:p>
+    <w:p>
+      <w:pPr>
+        <w:pStyle w:val="ListParagraph"/>
+      </w:pPr>
+    </w:p>
+    <w:p>
+      <w:pPr>
+        <w:pStyle w:val="ListParagraph"/>
+      </w:pPr>
+      <w:r>
+        <w:lastRenderedPageBreak/>
+        <w:t xml:space="preserve">Adding the </w:t>
+      </w:r>
+      <w:proofErr w:type="spellStart"/>
+      <w:r>
+        <w:t>Test_Connection</w:t>
+      </w:r>
+      <w:proofErr w:type="spellEnd"/>
+      <w:r>
+        <w:t xml:space="preserve"> Script:</w:t>
+      </w:r>
+      <w:r>
+        <w:rPr>
+          <w:noProof/>
+        </w:rPr>
+        <w:t xml:space="preserve"> </w:t>
+      </w:r>
+    </w:p>
+    <w:p>
+      <w:pPr>
+        <w:pStyle w:val="ListParagraph"/>
+      </w:pPr>
+      <w:r>
+        <w:drawing>
+          <wp:inline distT="0" distB="0" distL="0" distR="0" wp14:anchorId="05AACBCB" wp14:editId="5B42289B">
+            <wp:extent cx="5943600" cy="2677795"/>
+            <wp:effectExtent l="0" t="0" r="0" b="8255"/>
+            <wp:docPr id="1284304102" name="Picture 1"/>
+            <wp:cNvGraphicFramePr>
+              <a:graphicFrameLocks xmlns:a="http://schemas.openxmlformats.org/drawingml/2006/main" noChangeAspect="1"/>
+            </wp:cNvGraphicFramePr>
+            <a:graphic xmlns:a="http://schemas.openxmlformats.org/drawingml/2006/main">
+              <a:graphicData uri="http://schemas.openxmlformats.org/drawingml/2006/picture">
+                <pic:pic xmlns:pic="http://schemas.openxmlformats.org/drawingml/2006/picture">
+                  <pic:nvPicPr>
+                    <pic:cNvPr id="1284304102" name=""/>
+                    <pic:cNvPicPr/>
+                  </pic:nvPicPr>
+                  <pic:blipFill>
+                    <a:blip r:embed="rId14"/>
+                    <a:stretch>
+                      <a:fillRect/>
+                    </a:stretch>
+                  </pic:blipFill>
+                  <pic:spPr>
+                    <a:xfrm>
+                      <a:off x="0" y="0"/>
+                      <a:ext cx="5943600" cy="2677795"/>
+                    </a:xfrm>
+                    <a:prstGeom prst="rect">
+                      <a:avLst/>
+                    </a:prstGeom>
+                  </pic:spPr>
+                </pic:pic>
+              </a:graphicData>
+            </a:graphic>
+          </wp:inline>
+        </w:drawing>
+      </w:r>
+    </w:p>
+    <w:p>
+      <w:pPr>
+        <w:pStyle w:val="ListParagraph"/>
+      </w:pPr>
+    </w:p>
+    <w:p>
+      <w:pPr>
+        <w:pStyle w:val="ListParagraph"/>
+      </w:pPr>
+      <w:r>
+        <w:t>SSL Certificate Verification Issue</w:t>
+      </w:r>
+    </w:p>
+    <w:p>
+      <w:pPr>
+        <w:pStyle w:val="ListParagraph"/>
+      </w:pPr>
+    </w:p>
+    <w:p>
+      <w:pPr>
+        <w:pStyle w:val="ListParagraph"/>
+      </w:pPr>
+      <w:r>
+        <w:t>During execution of the Firebase Python application on a corporate-managed laptop, the script successfully loaded the Firebase service account credentials and initialized the Firebase application. However, the program stopped when attempting to write data to the Firebase Realtime Database.</w:t>
+      </w:r>
+    </w:p>
+    <w:p>
+      <w:pPr>
+        <w:pStyle w:val="ListParagraph"/>
+      </w:pPr>
+    </w:p>
+    <w:p>
+      <w:pPr>
+        <w:pStyle w:val="ListParagraph"/>
+      </w:pPr>
+      <w:r>
+        <w:t>The error investigation revealed the following message:</w:t>
+      </w:r>
+    </w:p>
+    <w:p>
+      <w:pPr>
+        <w:pStyle w:val="ListParagraph"/>
+      </w:pPr>
+    </w:p>
+    <w:p>
+      <w:pPr>
+        <w:pStyle w:val="ListParagraph"/>
+      </w:pPr>
+      <w:r>
+        <w:drawing>
+          <wp:inline distT="0" distB="0" distL="0" distR="0" wp14:anchorId="176C6FFF" wp14:editId="36114355">
+            <wp:extent cx="5306165" cy="724001"/>
+            <wp:effectExtent l="0" t="0" r="8890" b="0"/>
+            <wp:docPr id="988649891" name="Picture 1"/>
+            <wp:cNvGraphicFramePr>
+              <a:graphicFrameLocks xmlns:a="http://schemas.openxmlformats.org/drawingml/2006/main" noChangeAspect="1"/>
+            </wp:cNvGraphicFramePr>
+            <a:graphic xmlns:a="http://schemas.openxmlformats.org/drawingml/2006/main">
+              <a:graphicData uri="http://schemas.openxmlformats.org/drawingml/2006/picture">
+                <pic:pic xmlns:pic="http://schemas.openxmlformats.org/drawingml/2006/picture">
+                  <pic:nvPicPr>
+                    <pic:cNvPr id="988649891" name=""/>
+                    <pic:cNvPicPr/>
+                  </pic:nvPicPr>
+                  <pic:blipFill>
+                    <a:blip r:embed="rId15"/>
+                    <a:stretch>
+                      <a:fillRect/>
+                    </a:stretch>
+                  </pic:blipFill>
+                  <pic:spPr>
+                    <a:xfrm>
+                      <a:off x="0" y="0"/>
+                      <a:ext cx="5306165" cy="724001"/>
+                    </a:xfrm>
+                    <a:prstGeom prst="rect">
+                      <a:avLst/>
+                    </a:prstGeom>
+                  </pic:spPr>
+                </pic:pic>
+              </a:graphicData>
+            </a:graphic>
+          </wp:inline>
+        </w:drawing>
+      </w:r>
+    </w:p>
+    <w:p>
+      <w:pPr>
+        <w:pStyle w:val="ListParagraph"/>
+      </w:pPr>
+    </w:p>
+    <w:p>
+      <w:pPr>
+        <w:pStyle w:val="ListParagraph"/>
+      </w:pPr>
+      <w:r>
+        <w:t>This error indicates that Python was unable to validate the SSL certificate presented during the secure HTTPS connection to Firebase. The corporate network uses SSL inspection technology that replaces the original website certificate with an internally generated certificate. While web browsers on the corporate laptop trust the organization's certificate authority, Python does not automatically trust that certificate, causing the Firebase connection to fail.</w:t>
+      </w:r>
+    </w:p>
+    <w:p>
+      <w:pPr>
+        <w:pStyle w:val="ListParagraph"/>
+      </w:pPr>
+    </w:p>
+    <w:p>
+      <w:pPr>
+        <w:pStyle w:val="ListParagraph"/>
+        <w:rPr>
+          <w:b/>
+          <w:bCs/>
+        </w:rPr>
+      </w:pPr>
+      <w:r>
+        <w:rPr>
+          <w:b/>
+          <w:bCs/>
+        </w:rPr>
+        <w:t>Testing confirmed that:</w:t>
+      </w:r>
+    </w:p>
+    <w:p>
+      <w:pPr>
+        <w:pStyle w:val="ListParagraph"/>
+      </w:pPr>
+    </w:p>
+    <w:p>
+      <w:pPr>
+        <w:pStyle w:val="ListParagraph"/>
+      </w:pPr>
+      <w:r>
+        <w:t>The Firebase project was configured correctly.</w:t>
+      </w:r>
+    </w:p>
+    <w:p>
+      <w:pPr>
+        <w:pStyle w:val="ListParagraph"/>
+      </w:pPr>
+      <w:r>
+        <w:t>The Realtime Database URL was correct.</w:t>
+      </w:r>
+    </w:p>
+    <w:p>
+      <w:pPr>
+        <w:pStyle w:val="ListParagraph"/>
+      </w:pPr>
+      <w:r>
+        <w:t>The service account credentials were valid.</w:t>
+      </w:r>
+    </w:p>
+    <w:p>
+      <w:pPr>
+        <w:pStyle w:val="ListParagraph"/>
+      </w:pPr>
+      <w:r>
+        <w:t>The Firebase Admin SDK was installed successfully.</w:t>
+      </w:r>
+    </w:p>
+    <w:p>
+      <w:pPr>
+        <w:pStyle w:val="ListParagraph"/>
+      </w:pPr>
+      <w:r>
+        <w:t>The Firebase application initialized without errors.</w:t>
+      </w:r>
+    </w:p>
+    <w:p>
+      <w:pPr>
+        <w:pStyle w:val="ListParagraph"/>
+      </w:pPr>
+      <w:r>
+        <w:lastRenderedPageBreak/>
+        <w:t>The issue occurred only when attempting to communicate with the Firebase database over HTTPS.</w:t>
+      </w:r>
+    </w:p>
+    <w:p>
+      <w:pPr>
+        <w:pStyle w:val="ListParagraph"/>
+      </w:pPr>
+    </w:p>
+    <w:p>
+      <w:pPr>
+        <w:pStyle w:val="ListParagraph"/>
+      </w:pPr>
+      <w:r>
+        <w:t>To verify the cause, the same code was executed on a non-corporate computer. The script completed successfully and wrote the data to the Firebase Realtime Database as expected. This confirmed that the issue was related to the corporate computer's SSL certificate environment rather than the Firebase configuration or Python code.</w:t>
+      </w:r>
+    </w:p>
+    <w:p>
+      <w:pPr>
+        <w:pStyle w:val="ListParagraph"/>
+      </w:pPr>
+    </w:p>
+    <w:p>
+      <w:pPr>
+        <w:pStyle w:val="ListParagraph"/>
+        <w:rPr>
+          <w:b/>
+          <w:bCs/>
+        </w:rPr>
+      </w:pPr>
+      <w:r>
+        <w:rPr>
+          <w:b/>
+          <w:bCs/>
+        </w:rPr>
+        <w:t>Resolution</w:t>
+      </w:r>
+    </w:p>
+    <w:p>
+      <w:pPr>
+        <w:pStyle w:val="ListParagraph"/>
+      </w:pPr>
+    </w:p>
+    <w:p>
+      <w:pPr>
+        <w:pStyle w:val="ListParagraph"/>
+      </w:pPr>
+      <w:r>
+        <w:t>The activity was completed successfully by running the application on a different computer without the corporate SSL certificate restrictions. The Firebase database updated correctly, and the required records were created and modified according to the assignment requirements.</w:t>
+      </w:r>
+    </w:p>
+    <w:p>
+      <w:pPr>
+        <w:pStyle w:val="ListParagraph"/>
+      </w:pPr>
     </w:p>
     <w:p>
       <w:pPr>
@@ -486,6 +959,48 @@
       <w:pPr>
         <w:pStyle w:val="ListParagraph"/>
       </w:pPr>
+      <w:r>
+        <w:drawing>
+          <wp:inline distT="0" distB="0" distL="0" distR="0" wp14:anchorId="7932301A" wp14:editId="10441CA7">
+            <wp:extent cx="5943600" cy="821690"/>
+            <wp:effectExtent l="0" t="0" r="0" b="0"/>
+            <wp:docPr id="1725288990" name="Picture 1"/>
+            <wp:cNvGraphicFramePr>
+              <a:graphicFrameLocks xmlns:a="http://schemas.openxmlformats.org/drawingml/2006/main" noChangeAspect="1"/>
+            </wp:cNvGraphicFramePr>
+            <a:graphic xmlns:a="http://schemas.openxmlformats.org/drawingml/2006/main">
+              <a:graphicData uri="http://schemas.openxmlformats.org/drawingml/2006/picture">
+                <pic:pic xmlns:pic="http://schemas.openxmlformats.org/drawingml/2006/picture">
+                  <pic:nvPicPr>
+                    <pic:cNvPr id="1725288990" name=""/>
+                    <pic:cNvPicPr/>
+                  </pic:nvPicPr>
+                  <pic:blipFill>
+                    <a:blip r:embed="rId16"/>
+                    <a:stretch>
+                      <a:fillRect/>
+                    </a:stretch>
+                  </pic:blipFill>
+                  <pic:spPr>
+                    <a:xfrm>
+                      <a:off x="0" y="0"/>
+                      <a:ext cx="5943600" cy="821690"/>
+                    </a:xfrm>
+                    <a:prstGeom prst="rect">
+                      <a:avLst/>
+                    </a:prstGeom>
+                  </pic:spPr>
+                </pic:pic>
+              </a:graphicData>
+            </a:graphic>
+          </wp:inline>
+        </w:drawing>
+      </w:r>
+    </w:p>
+    <w:p>
+      <w:pPr>
+        <w:pStyle w:val="ListParagraph"/>
+      </w:pPr>
     </w:p>
     <w:p>
       <w:pPr>
@@ -496,7 +1011,6 @@
         </w:numPr>
       </w:pPr>
       <w:r>
-        <w:lastRenderedPageBreak/>
         <w:t>Provide a screenshot of your Terminal window to show that your database has been written as expected.</w:t>
       </w:r>
     </w:p>
@@ -504,29 +1018,14 @@
       <w:pPr>
         <w:pStyle w:val="ListParagraph"/>
       </w:pPr>
-    </w:p>
-    <w:p>
-      <w:pPr>
-        <w:pStyle w:val="ListParagraph"/>
-      </w:pPr>
-      <w:r>
-        <w:t>Update on Database properly reflected:</w:t>
-      </w:r>
-    </w:p>
-    <w:p>
-      <w:pPr>
-        <w:pStyle w:val="ListParagraph"/>
-      </w:pPr>
-    </w:p>
-    <w:p>
-      <w:pPr>
-        <w:pStyle w:val="ListParagraph"/>
-      </w:pPr>
-      <w:r>
+      <w:r>
+        <w:rPr>
+          <w:noProof/>
+        </w:rPr>
         <w:drawing>
-          <wp:inline distT="0" distB="0" distL="0" distR="0" wp14:anchorId="16399364" wp14:editId="6DA24603">
-            <wp:extent cx="5943600" cy="4399915"/>
-            <wp:effectExtent l="0" t="0" r="0" b="635"/>
+          <wp:inline distT="0" distB="0" distL="0" distR="0" wp14:anchorId="16399364" wp14:editId="4F87DF02">
+            <wp:extent cx="4848225" cy="3589033"/>
+            <wp:effectExtent l="0" t="0" r="0" b="0"/>
             <wp:docPr id="1758745916" name="Picture 1"/>
             <wp:cNvGraphicFramePr>
               <a:graphicFrameLocks xmlns:a="http://schemas.openxmlformats.org/drawingml/2006/main" noChangeAspect="1"/>
@@ -539,7 +1038,7 @@
                     <pic:cNvPicPr/>
                   </pic:nvPicPr>
                   <pic:blipFill>
-                    <a:blip r:embed="rId12"/>
+                    <a:blip r:embed="rId17"/>
                     <a:stretch>
                       <a:fillRect/>
                     </a:stretch>
@@ -547,7 +1046,7 @@
                   <pic:spPr>
                     <a:xfrm>
                       <a:off x="0" y="0"/>
-                      <a:ext cx="5943600" cy="4399915"/>
+                      <a:ext cx="4851032" cy="3591111"/>
                     </a:xfrm>
                     <a:prstGeom prst="rect">
                       <a:avLst/>

</xml_diff>